<commit_message>
JSHSHIR (ЖШШИР) maydoni: mijoz kabineti, Excel va notarius hujjatlari
- Mijozga 14 xonali JSHSHIR (migratsiya 004), server va formada tekshiruv
- Excel: "JSHSHIR" ustuni import/eksport, noto'g'ri uzunlikda ogohlantirish
- Notarius shabloni: shartnoma matnida pasportdan keyin va rekvizitlarda JSHSHIR qatori

Co-Authored-By: Claude Opus 5.5 <noreply@anthropic.com>
Claude-Session: https://claude.ai/code/session_01G9WivAZZ9qYb1i7M62fHj5
</commit_message>
<xml_diff>
--- a/public/templates/notarius_shablon.docx
+++ b/public/templates/notarius_shablon.docx
@@ -321,7 +321,7 @@
         <w:rPr>
           <w:lang w:val="uz-Cyrl-UZ"/>
         </w:rPr>
-        <w:t xml:space="preserve"> {pasportKimTomonidan} томонидан {pasportSanasi} йилда берилган билан Зарафшон шаҳар, 14-кичик туман, қуриладиган турар-жой</w:t>
+        <w:t xml:space="preserve"> (ЖШШИР {jshshir}) {pasportKimTomonidan} томонидан {pasportSanasi} йилда берилган билан Зарафшон шаҳар, 14-кичик туман, қуриладиган турар-жой</w:t>
       </w:r>
       <w:r>
         <w:rPr>
@@ -1597,6 +1597,25 @@
                 <w:lang w:val="uz-Cyrl-UZ"/>
               </w:rPr>
               <w:t>№{pasportRaqam}</w:t>
+            </w:r>
+          </w:p>
+          <w:p>
+            <w:pPr>
+              <w:pStyle w:val="Normal"/>
+              <w:autoSpaceDE w:val="false"/>
+              <w:ind w:start="145" w:end="0"/>
+              <w:rPr>
+                <w:sz w:val="24"/>
+                <w:szCs w:val="22"/>
+                <w:lang w:val="en-US" w:eastAsia="en-US"/>
+              </w:rPr>
+            </w:pPr>
+            <w:r>
+              <w:rPr>
+                <w:rFonts w:eastAsia="Times New Roman"/>
+                <w:lang w:val="uz-Cyrl-UZ"/>
+              </w:rPr>
+              <w:t xml:space="preserve"> ЖШШИР: {jshshir}</w:t>
             </w:r>
           </w:p>
         </w:tc>

</xml_diff>